<commit_message>
Reflect three-member group: soil water is a shared feature
</commit_message>
<xml_diff>
--- a/presentation/Evolutionary-Suicide-LifeEngine-Report.docx
+++ b/presentation/Evolutionary-Suicide-LifeEngine-Report.docx
@@ -260,8 +260,8 @@
         <w:autoSpaceDN w:val="0"/>
         <w:autoSpaceDE w:val="0"/>
         <w:widowControl/>
-        <w:spacing w:line="281" w:lineRule="auto" w:before="210" w:after="0"/>
-        <w:ind w:left="22" w:right="144" w:firstLine="0"/>
+        <w:spacing w:line="274" w:lineRule="auto" w:before="210" w:after="0"/>
+        <w:ind w:left="22" w:right="0" w:firstLine="0"/>
         <w:jc w:val="left"/>
       </w:pPr>
       <w:r>
@@ -282,7 +282,7 @@
           <w:color w:val="1F1E1D"/>
           <w:sz w:val="24"/>
         </w:rPr>
-        <w:t xml:space="preserve">We added grazing, poorer bush food, hunger, meat-eating leopards, a sprint rule, the four </w:t>
+        <w:t xml:space="preserve">We added grazing, poorer bush food, hunger, meat-eating leopards, a sprint rule, the three </w:t>
       </w:r>
       <w:r>
         <w:rPr>
@@ -292,7 +292,27 @@
           <w:color w:val="1F1E1D"/>
           <w:sz w:val="24"/>
         </w:rPr>
-        <w:t xml:space="preserve">member cells (horn, stripe, cache and soil water), a river, trees and fire. Zebras evolved a </w:t>
+        <w:t>member cells (horn, stripe and cache), a shared soil-water system, a river, trees and fire.</w:t>
+      </w:r>
+    </w:p>
+    <w:p>
+      <w:pPr>
+        <w:autoSpaceDN w:val="0"/>
+        <w:autoSpaceDE w:val="0"/>
+        <w:widowControl/>
+        <w:spacing w:line="276" w:lineRule="auto" w:before="58" w:after="0"/>
+        <w:ind w:left="22" w:right="0" w:firstLine="0"/>
+        <w:jc w:val="left"/>
+      </w:pPr>
+      <w:r>
+        <w:rPr>
+          <w:rFonts w:ascii="Anthropic Sans Print" w:hAnsi="Anthropic Sans Print" w:eastAsia="Anthropic Sans Print"/>
+          <w:b w:val="0"/>
+          <w:i w:val="0"/>
+          <w:color w:val="1F1E1D"/>
+          <w:sz w:val="24"/>
+        </w:rPr>
+        <w:t xml:space="preserve">Zebras evolved a second mouth wherever they survived, but grass never collapsed as a </w:t>
       </w:r>
       <w:r>
         <w:rPr>
@@ -302,7 +322,7 @@
           <w:color w:val="1F1E1D"/>
           <w:sz w:val="24"/>
         </w:rPr>
-        <w:t xml:space="preserve">second mouth wherever they survived, but grass never collapsed as a result, so the </w:t>
+        <w:t xml:space="preserve">result, so the overgrazing suicide did not happen. The environment mattered as much as </w:t>
       </w:r>
       <w:r>
         <w:rPr>
@@ -312,7 +332,7 @@
           <w:color w:val="1F1E1D"/>
           <w:sz w:val="24"/>
         </w:rPr>
-        <w:t xml:space="preserve">overgrazing suicide did not happen. The environment mattered as much as the species: </w:t>
+        <w:t xml:space="preserve">the species: without the river or the soil-water system every zebra lineage died out within </w:t>
       </w:r>
       <w:r>
         <w:rPr>
@@ -322,17 +342,7 @@
           <w:color w:val="1F1E1D"/>
           <w:sz w:val="24"/>
         </w:rPr>
-        <w:t xml:space="preserve">without the river or the soil-water system every zebra lineage died out within 40,000 </w:t>
-      </w:r>
-      <w:r>
-        <w:rPr>
-          <w:rFonts w:ascii="Anthropic Sans Print" w:hAnsi="Anthropic Sans Print" w:eastAsia="Anthropic Sans Print"/>
-          <w:b w:val="0"/>
-          <w:i w:val="0"/>
-          <w:color w:val="1F1E1D"/>
-          <w:sz w:val="24"/>
-        </w:rPr>
-        <w:t>ticks, compared with one in five in the full design.</w:t>
+        <w:t>40,000 ticks, compared with one in five in the full design.</w:t>
       </w:r>
     </w:p>
     <w:p>
@@ -6786,7 +6796,7 @@
         <w:autoSpaceDN w:val="0"/>
         <w:autoSpaceDE w:val="0"/>
         <w:widowControl/>
-        <w:spacing w:line="240" w:lineRule="auto" w:before="196" w:after="416"/>
+        <w:spacing w:line="264" w:lineRule="auto" w:before="196" w:after="418"/>
         <w:ind w:left="22" w:right="0" w:firstLine="0"/>
         <w:jc w:val="left"/>
       </w:pPr>
@@ -6798,7 +6808,17 @@
           <w:color w:val="1F1E1D"/>
           <w:sz w:val="24"/>
         </w:rPr>
-        <w:t>Each group member built one feature.</w:t>
+        <w:t xml:space="preserve">Each of the three group members built one cell, and the soil-water system was built by the </w:t>
+      </w:r>
+      <w:r>
+        <w:rPr>
+          <w:rFonts w:ascii="Anthropic Sans Print" w:hAnsi="Anthropic Sans Print" w:eastAsia="Anthropic Sans Print"/>
+          <w:b w:val="0"/>
+          <w:i w:val="0"/>
+          <w:color w:val="1F1E1D"/>
+          <w:sz w:val="24"/>
+        </w:rPr>
+        <w:t>group together.</w:t>
       </w:r>
     </w:p>
     <w:tbl>
@@ -6826,7 +6846,7 @@
               <w:start w:sz="5.600000000000023" w:val="single" w:color="#E7E4DB"/>
               <w:top w:sz="6.400000000000091" w:val="single" w:color="#E7E4DB"/>
               <w:end w:sz="5.600000000000023" w:val="single" w:color="#E7E4DB"/>
-              <w:bottom w:sz="5.599999999999909" w:val="single" w:color="#E7E4DB"/>
+              <w:bottom w:sz="6.399999999999636" w:val="single" w:color="#E7E4DB"/>
             </w:tcBorders>
             <w:shd w:fill="f5f2ec"/>
             <w:tcMar>
@@ -6839,7 +6859,7 @@
               <w:autoSpaceDN w:val="0"/>
               <w:autoSpaceDE w:val="0"/>
               <w:widowControl/>
-              <w:spacing w:line="240" w:lineRule="auto" w:before="106" w:after="0"/>
+              <w:spacing w:line="238" w:lineRule="auto" w:before="106" w:after="0"/>
               <w:ind w:left="144" w:right="0" w:firstLine="0"/>
               <w:jc w:val="left"/>
             </w:pPr>
@@ -6858,12 +6878,12 @@
         </w:tc>
         <w:tc>
           <w:tcPr>
-            <w:tcW w:type="dxa" w:w="1782"/>
+            <w:tcW w:type="dxa" w:w="1766"/>
             <w:tcBorders>
               <w:start w:sz="5.600000000000023" w:val="single" w:color="#E7E4DB"/>
               <w:top w:sz="6.400000000000091" w:val="single" w:color="#E7E4DB"/>
-              <w:end w:sz="5.599999999999909" w:val="single" w:color="#E7E4DB"/>
-              <w:bottom w:sz="5.599999999999909" w:val="single" w:color="#E7E4DB"/>
+              <w:end w:sz="6.400000000000091" w:val="single" w:color="#E7E4DB"/>
+              <w:bottom w:sz="6.399999999999636" w:val="single" w:color="#E7E4DB"/>
             </w:tcBorders>
             <w:shd w:fill="f5f2ec"/>
             <w:tcMar>
@@ -6876,8 +6896,8 @@
               <w:autoSpaceDN w:val="0"/>
               <w:autoSpaceDE w:val="0"/>
               <w:widowControl/>
-              <w:spacing w:line="240" w:lineRule="auto" w:before="106" w:after="0"/>
-              <w:ind w:left="146" w:right="0" w:firstLine="0"/>
+              <w:spacing w:line="238" w:lineRule="auto" w:before="106" w:after="0"/>
+              <w:ind w:left="148" w:right="0" w:firstLine="0"/>
               <w:jc w:val="left"/>
             </w:pPr>
             <w:r>
@@ -6895,12 +6915,12 @@
         </w:tc>
         <w:tc>
           <w:tcPr>
-            <w:tcW w:type="dxa" w:w="3068"/>
+            <w:tcW w:type="dxa" w:w="3084"/>
             <w:tcBorders>
-              <w:start w:sz="5.599999999999909" w:val="single" w:color="#E7E4DB"/>
+              <w:start w:sz="6.400000000000091" w:val="single" w:color="#E7E4DB"/>
               <w:top w:sz="6.400000000000091" w:val="single" w:color="#E7E4DB"/>
               <w:end w:sz="5.599999999999909" w:val="single" w:color="#E7E4DB"/>
-              <w:bottom w:sz="5.599999999999909" w:val="single" w:color="#E7E4DB"/>
+              <w:bottom w:sz="6.399999999999636" w:val="single" w:color="#E7E4DB"/>
             </w:tcBorders>
             <w:shd w:fill="f5f2ec"/>
             <w:tcMar>
@@ -6913,8 +6933,8 @@
               <w:autoSpaceDN w:val="0"/>
               <w:autoSpaceDE w:val="0"/>
               <w:widowControl/>
-              <w:spacing w:line="240" w:lineRule="auto" w:before="106" w:after="0"/>
-              <w:ind w:left="142" w:right="0" w:firstLine="0"/>
+              <w:spacing w:line="238" w:lineRule="auto" w:before="106" w:after="0"/>
+              <w:ind w:left="154" w:right="0" w:firstLine="0"/>
               <w:jc w:val="left"/>
             </w:pPr>
             <w:r>
@@ -6937,7 +6957,7 @@
               <w:start w:sz="5.599999999999909" w:val="single" w:color="#E7E4DB"/>
               <w:top w:sz="6.400000000000091" w:val="single" w:color="#E7E4DB"/>
               <w:end w:sz="6.399999999999636" w:val="single" w:color="#E7E4DB"/>
-              <w:bottom w:sz="5.599999999999909" w:val="single" w:color="#E7E4DB"/>
+              <w:bottom w:sz="6.399999999999636" w:val="single" w:color="#E7E4DB"/>
             </w:tcBorders>
             <w:shd w:fill="f5f2ec"/>
             <w:tcMar>
@@ -6951,7 +6971,7 @@
               <w:autoSpaceDE w:val="0"/>
               <w:widowControl/>
               <w:spacing w:line="259" w:lineRule="auto" w:before="106" w:after="0"/>
-              <w:ind w:left="152" w:right="144" w:firstLine="0"/>
+              <w:ind w:left="150" w:right="144" w:firstLine="0"/>
               <w:jc w:val="left"/>
             </w:pPr>
             <w:r>
@@ -6985,7 +7005,7 @@
               <w:start w:sz="6.399999999999636" w:val="single" w:color="#E7E4DB"/>
               <w:top w:sz="6.400000000000091" w:val="single" w:color="#E7E4DB"/>
               <w:end w:sz="6.399999999999636" w:val="single" w:color="#E7E4DB"/>
-              <w:bottom w:sz="5.599999999999909" w:val="single" w:color="#E7E4DB"/>
+              <w:bottom w:sz="6.399999999999636" w:val="single" w:color="#E7E4DB"/>
             </w:tcBorders>
             <w:shd w:fill="f5f2ec"/>
             <w:tcMar>
@@ -6998,7 +7018,7 @@
               <w:autoSpaceDN w:val="0"/>
               <w:autoSpaceDE w:val="0"/>
               <w:widowControl/>
-              <w:spacing w:line="264" w:lineRule="auto" w:before="106" w:after="0"/>
+              <w:spacing w:line="262" w:lineRule="auto" w:before="106" w:after="0"/>
               <w:ind w:left="146" w:right="144" w:firstLine="0"/>
               <w:jc w:val="left"/>
             </w:pPr>
@@ -7043,16 +7063,16 @@
       </w:tr>
       <w:tr>
         <w:trPr>
-          <w:trHeight w:hRule="exact" w:val="2488"/>
+          <w:trHeight w:hRule="exact" w:val="2486"/>
         </w:trPr>
         <w:tc>
           <w:tcPr>
             <w:tcW w:type="dxa" w:w="1304"/>
             <w:tcBorders>
               <w:start w:sz="5.600000000000023" w:val="single" w:color="#E7E4DB"/>
-              <w:top w:sz="5.599999999999909" w:val="single" w:color="#E7E4DB"/>
+              <w:top w:sz="6.399999999999636" w:val="single" w:color="#E7E4DB"/>
               <w:end w:sz="5.600000000000023" w:val="single" w:color="#E7E4DB"/>
-              <w:bottom w:sz="5.600000000000364" w:val="single" w:color="#E7E4DB"/>
+              <w:bottom w:sz="6.400000000000546" w:val="single" w:color="#E7E4DB"/>
             </w:tcBorders>
             <w:tcMar>
               <w:start w:w="0" w:type="dxa"/>
@@ -7083,12 +7103,12 @@
         </w:tc>
         <w:tc>
           <w:tcPr>
-            <w:tcW w:type="dxa" w:w="1782"/>
+            <w:tcW w:type="dxa" w:w="1766"/>
             <w:tcBorders>
               <w:start w:sz="5.600000000000023" w:val="single" w:color="#E7E4DB"/>
-              <w:top w:sz="5.599999999999909" w:val="single" w:color="#E7E4DB"/>
-              <w:end w:sz="5.599999999999909" w:val="single" w:color="#E7E4DB"/>
-              <w:bottom w:sz="5.600000000000364" w:val="single" w:color="#E7E4DB"/>
+              <w:top w:sz="6.399999999999636" w:val="single" w:color="#E7E4DB"/>
+              <w:end w:sz="6.400000000000091" w:val="single" w:color="#E7E4DB"/>
+              <w:bottom w:sz="6.400000000000546" w:val="single" w:color="#E7E4DB"/>
             </w:tcBorders>
             <w:tcMar>
               <w:start w:w="0" w:type="dxa"/>
@@ -7101,7 +7121,7 @@
               <w:autoSpaceDE w:val="0"/>
               <w:widowControl/>
               <w:spacing w:line="240" w:lineRule="auto" w:before="106" w:after="0"/>
-              <w:ind w:left="146" w:right="0" w:firstLine="0"/>
+              <w:ind w:left="148" w:right="0" w:firstLine="0"/>
               <w:jc w:val="left"/>
             </w:pPr>
             <w:r>
@@ -7119,12 +7139,12 @@
         </w:tc>
         <w:tc>
           <w:tcPr>
-            <w:tcW w:type="dxa" w:w="3068"/>
+            <w:tcW w:type="dxa" w:w="3084"/>
             <w:tcBorders>
-              <w:start w:sz="5.599999999999909" w:val="single" w:color="#E7E4DB"/>
-              <w:top w:sz="5.599999999999909" w:val="single" w:color="#E7E4DB"/>
+              <w:start w:sz="6.400000000000091" w:val="single" w:color="#E7E4DB"/>
+              <w:top w:sz="6.399999999999636" w:val="single" w:color="#E7E4DB"/>
               <w:end w:sz="5.599999999999909" w:val="single" w:color="#E7E4DB"/>
-              <w:bottom w:sz="5.600000000000364" w:val="single" w:color="#E7E4DB"/>
+              <w:bottom w:sz="6.400000000000546" w:val="single" w:color="#E7E4DB"/>
             </w:tcBorders>
             <w:tcMar>
               <w:start w:w="0" w:type="dxa"/>
@@ -7148,7 +7168,7 @@
               <w:tblInd w:w="150.0" w:type="dxa"/>
             </w:tblPr>
             <w:tblGrid>
-              <w:gridCol w:w="3068"/>
+              <w:gridCol w:w="3084"/>
             </w:tblGrid>
             <w:tr>
               <w:trPr>
@@ -7156,7 +7176,7 @@
               </w:trPr>
               <w:tc>
                 <w:tcPr>
-                  <w:tcW w:type="dxa" w:w="1452"/>
+                  <w:tcW w:type="dxa" w:w="1466"/>
                   <w:tcBorders/>
                   <w:shd w:fill="f2f1ec"/>
                   <w:tcMar>
@@ -7203,9 +7223,9 @@
             <w:tcW w:type="dxa" w:w="1978"/>
             <w:tcBorders>
               <w:start w:sz="5.599999999999909" w:val="single" w:color="#E7E4DB"/>
-              <w:top w:sz="5.599999999999909" w:val="single" w:color="#E7E4DB"/>
+              <w:top w:sz="6.399999999999636" w:val="single" w:color="#E7E4DB"/>
               <w:end w:sz="6.399999999999636" w:val="single" w:color="#E7E4DB"/>
-              <w:bottom w:sz="5.600000000000364" w:val="single" w:color="#E7E4DB"/>
+              <w:bottom w:sz="6.400000000000546" w:val="single" w:color="#E7E4DB"/>
             </w:tcBorders>
             <w:tcMar>
               <w:start w:w="0" w:type="dxa"/>
@@ -7218,7 +7238,7 @@
               <w:autoSpaceDE w:val="0"/>
               <w:widowControl/>
               <w:spacing w:line="266" w:lineRule="auto" w:before="106" w:after="0"/>
-              <w:ind w:left="152" w:right="144" w:firstLine="0"/>
+              <w:ind w:left="150" w:right="144" w:firstLine="0"/>
               <w:jc w:val="left"/>
             </w:pPr>
             <w:r>
@@ -7261,9 +7281,9 @@
             <w:tcW w:type="dxa" w:w="1918"/>
             <w:tcBorders>
               <w:start w:sz="6.399999999999636" w:val="single" w:color="#E7E4DB"/>
-              <w:top w:sz="5.599999999999909" w:val="single" w:color="#E7E4DB"/>
+              <w:top w:sz="6.399999999999636" w:val="single" w:color="#E7E4DB"/>
               <w:end w:sz="6.399999999999636" w:val="single" w:color="#E7E4DB"/>
-              <w:bottom w:sz="5.600000000000364" w:val="single" w:color="#E7E4DB"/>
+              <w:bottom w:sz="6.400000000000546" w:val="single" w:color="#E7E4DB"/>
             </w:tcBorders>
             <w:tcMar>
               <w:start w:w="0" w:type="dxa"/>
@@ -7373,16 +7393,16 @@
       </w:tr>
       <w:tr>
         <w:trPr>
-          <w:trHeight w:hRule="exact" w:val="2800"/>
+          <w:trHeight w:hRule="exact" w:val="2802"/>
         </w:trPr>
         <w:tc>
           <w:tcPr>
             <w:tcW w:type="dxa" w:w="1304"/>
             <w:tcBorders>
               <w:start w:sz="5.600000000000023" w:val="single" w:color="#E7E4DB"/>
-              <w:top w:sz="5.600000000000364" w:val="single" w:color="#E7E4DB"/>
+              <w:top w:sz="6.400000000000546" w:val="single" w:color="#E7E4DB"/>
               <w:end w:sz="5.600000000000023" w:val="single" w:color="#E7E4DB"/>
-              <w:bottom w:sz="6.399999999999636" w:val="single" w:color="#E7E4DB"/>
+              <w:bottom w:sz="5.600000000000364" w:val="single" w:color="#E7E4DB"/>
             </w:tcBorders>
             <w:tcMar>
               <w:start w:w="0" w:type="dxa"/>
@@ -7394,7 +7414,7 @@
               <w:autoSpaceDN w:val="0"/>
               <w:autoSpaceDE w:val="0"/>
               <w:widowControl/>
-              <w:spacing w:line="262" w:lineRule="auto" w:before="104" w:after="0"/>
+              <w:spacing w:line="259" w:lineRule="auto" w:before="106" w:after="0"/>
               <w:ind w:left="144" w:right="432" w:firstLine="0"/>
               <w:jc w:val="left"/>
             </w:pPr>
@@ -7427,12 +7447,12 @@
         </w:tc>
         <w:tc>
           <w:tcPr>
-            <w:tcW w:type="dxa" w:w="1782"/>
+            <w:tcW w:type="dxa" w:w="1766"/>
             <w:tcBorders>
               <w:start w:sz="5.600000000000023" w:val="single" w:color="#E7E4DB"/>
-              <w:top w:sz="5.600000000000364" w:val="single" w:color="#E7E4DB"/>
-              <w:end w:sz="5.599999999999909" w:val="single" w:color="#E7E4DB"/>
-              <w:bottom w:sz="6.399999999999636" w:val="single" w:color="#E7E4DB"/>
+              <w:top w:sz="6.400000000000546" w:val="single" w:color="#E7E4DB"/>
+              <w:end w:sz="6.400000000000091" w:val="single" w:color="#E7E4DB"/>
+              <w:bottom w:sz="5.600000000000364" w:val="single" w:color="#E7E4DB"/>
             </w:tcBorders>
             <w:tcMar>
               <w:start w:w="0" w:type="dxa"/>
@@ -7444,7 +7464,7 @@
               <w:autoSpaceDN w:val="0"/>
               <w:autoSpaceDE w:val="0"/>
               <w:widowControl/>
-              <w:spacing w:line="240" w:lineRule="auto" w:before="104" w:after="0"/>
+              <w:spacing w:line="240" w:lineRule="auto" w:before="106" w:after="0"/>
               <w:ind w:left="0" w:right="0" w:firstLine="0"/>
               <w:jc w:val="center"/>
             </w:pPr>
@@ -7463,12 +7483,12 @@
         </w:tc>
         <w:tc>
           <w:tcPr>
-            <w:tcW w:type="dxa" w:w="3068"/>
+            <w:tcW w:type="dxa" w:w="3084"/>
             <w:tcBorders>
-              <w:start w:sz="5.599999999999909" w:val="single" w:color="#E7E4DB"/>
-              <w:top w:sz="5.600000000000364" w:val="single" w:color="#E7E4DB"/>
+              <w:start w:sz="6.400000000000091" w:val="single" w:color="#E7E4DB"/>
+              <w:top w:sz="6.400000000000546" w:val="single" w:color="#E7E4DB"/>
               <w:end w:sz="5.599999999999909" w:val="single" w:color="#E7E4DB"/>
-              <w:bottom w:sz="6.399999999999636" w:val="single" w:color="#E7E4DB"/>
+              <w:bottom w:sz="5.600000000000364" w:val="single" w:color="#E7E4DB"/>
             </w:tcBorders>
             <w:tcMar>
               <w:start w:w="0" w:type="dxa"/>
@@ -7480,8 +7500,8 @@
               <w:autoSpaceDN w:val="0"/>
               <w:autoSpaceDE w:val="0"/>
               <w:widowControl/>
-              <w:spacing w:line="245" w:lineRule="auto" w:before="104" w:after="40"/>
-              <w:ind w:left="204" w:right="0" w:firstLine="0"/>
+              <w:spacing w:line="245" w:lineRule="auto" w:before="106" w:after="42"/>
+              <w:ind w:left="214" w:right="0" w:firstLine="0"/>
               <w:jc w:val="left"/>
             </w:pPr>
             <w:r>
@@ -7528,15 +7548,15 @@
               <w:tblInd w:w="150.0" w:type="dxa"/>
             </w:tblPr>
             <w:tblGrid>
-              <w:gridCol w:w="3068"/>
+              <w:gridCol w:w="3084"/>
             </w:tblGrid>
             <w:tr>
               <w:trPr>
-                <w:trHeight w:hRule="exact" w:val="266"/>
+                <w:trHeight w:hRule="exact" w:val="264"/>
               </w:trPr>
               <w:tc>
                 <w:tcPr>
-                  <w:tcW w:type="dxa" w:w="1334"/>
+                  <w:tcW w:type="dxa" w:w="1332"/>
                   <w:tcBorders/>
                   <w:shd w:fill="f2f1ec"/>
                   <w:tcMar>
@@ -7583,9 +7603,9 @@
             <w:tcW w:type="dxa" w:w="1978"/>
             <w:tcBorders>
               <w:start w:sz="5.599999999999909" w:val="single" w:color="#E7E4DB"/>
-              <w:top w:sz="5.600000000000364" w:val="single" w:color="#E7E4DB"/>
+              <w:top w:sz="6.400000000000546" w:val="single" w:color="#E7E4DB"/>
               <w:end w:sz="6.399999999999636" w:val="single" w:color="#E7E4DB"/>
-              <w:bottom w:sz="6.399999999999636" w:val="single" w:color="#E7E4DB"/>
+              <w:bottom w:sz="5.600000000000364" w:val="single" w:color="#E7E4DB"/>
             </w:tcBorders>
             <w:tcMar>
               <w:start w:w="0" w:type="dxa"/>
@@ -7597,8 +7617,8 @@
               <w:autoSpaceDN w:val="0"/>
               <w:autoSpaceDE w:val="0"/>
               <w:widowControl/>
-              <w:spacing w:line="269" w:lineRule="auto" w:before="104" w:after="0"/>
-              <w:ind w:left="152" w:right="144" w:firstLine="0"/>
+              <w:spacing w:line="266" w:lineRule="auto" w:before="106" w:after="0"/>
+              <w:ind w:left="150" w:right="144" w:firstLine="0"/>
               <w:jc w:val="left"/>
             </w:pPr>
             <w:r>
@@ -7655,9 +7675,9 @@
             <w:tcW w:type="dxa" w:w="1918"/>
             <w:tcBorders>
               <w:start w:sz="6.399999999999636" w:val="single" w:color="#E7E4DB"/>
-              <w:top w:sz="5.600000000000364" w:val="single" w:color="#E7E4DB"/>
+              <w:top w:sz="6.400000000000546" w:val="single" w:color="#E7E4DB"/>
               <w:end w:sz="6.399999999999636" w:val="single" w:color="#E7E4DB"/>
-              <w:bottom w:sz="6.399999999999636" w:val="single" w:color="#E7E4DB"/>
+              <w:bottom w:sz="5.600000000000364" w:val="single" w:color="#E7E4DB"/>
             </w:tcBorders>
             <w:tcMar>
               <w:start w:w="0" w:type="dxa"/>
@@ -7669,7 +7689,7 @@
               <w:autoSpaceDN w:val="0"/>
               <w:autoSpaceDE w:val="0"/>
               <w:widowControl/>
-              <w:spacing w:line="274" w:lineRule="auto" w:before="104" w:after="0"/>
+              <w:spacing w:line="274" w:lineRule="auto" w:before="106" w:after="0"/>
               <w:ind w:left="146" w:right="288" w:firstLine="0"/>
               <w:jc w:val="left"/>
             </w:pPr>
@@ -7785,7 +7805,7 @@
         <w:autoSpaceDN w:val="0"/>
         <w:autoSpaceDE w:val="0"/>
         <w:widowControl/>
-        <w:spacing w:line="1390" w:lineRule="exact" w:before="0" w:after="0"/>
+        <w:spacing w:line="1030" w:lineRule="exact" w:before="0" w:after="0"/>
         <w:ind w:left="0" w:right="0"/>
       </w:pPr>
     </w:p>
@@ -7824,11 +7844,11 @@
         </w:tc>
         <w:tc>
           <w:tcPr>
-            <w:tcW w:type="dxa" w:w="1782"/>
+            <w:tcW w:type="dxa" w:w="1766"/>
             <w:tcBorders>
               <w:start w:sz="5.600000000000023" w:val="single" w:color="#E7E4DB"/>
               <w:top w:sz="6.400000000000546" w:val="single" w:color="#E7E4DB"/>
-              <w:end w:sz="5.599999999999909" w:val="single" w:color="#E7E4DB"/>
+              <w:end w:sz="6.400000000000091" w:val="single" w:color="#E7E4DB"/>
             </w:tcBorders>
             <w:tcMar>
               <w:start w:w="0" w:type="dxa"/>
@@ -7839,9 +7859,9 @@
         </w:tc>
         <w:tc>
           <w:tcPr>
-            <w:tcW w:type="dxa" w:w="3068"/>
+            <w:tcW w:type="dxa" w:w="3084"/>
             <w:tcBorders>
-              <w:start w:sz="5.599999999999909" w:val="single" w:color="#E7E4DB"/>
+              <w:start w:sz="6.400000000000091" w:val="single" w:color="#E7E4DB"/>
               <w:top w:sz="6.400000000000546" w:val="single" w:color="#E7E4DB"/>
               <w:end w:sz="5.599999999999909" w:val="single" w:color="#E7E4DB"/>
             </w:tcBorders>
@@ -8017,9 +8037,46 @@
         </w:tc>
         <w:tc>
           <w:tcPr>
-            <w:tcW w:type="dxa" w:w="1782"/>
+            <w:tcW w:type="dxa" w:w="1766"/>
             <w:tcBorders>
               <w:start w:sz="5.600000000000023" w:val="single" w:color="#E7E4DB"/>
+              <w:top w:sz="6.399999999999977" w:val="single" w:color="#E7E4DB"/>
+              <w:end w:sz="6.400000000000091" w:val="single" w:color="#E7E4DB"/>
+              <w:bottom w:sz="6.399999999999977" w:val="single" w:color="#E7E4DB"/>
+            </w:tcBorders>
+            <w:shd w:fill="f5f2ec"/>
+            <w:tcMar>
+              <w:start w:w="0" w:type="dxa"/>
+              <w:end w:w="0" w:type="dxa"/>
+            </w:tcMar>
+          </w:tcPr>
+          <w:p>
+            <w:pPr>
+              <w:autoSpaceDN w:val="0"/>
+              <w:autoSpaceDE w:val="0"/>
+              <w:widowControl/>
+              <w:spacing w:line="240" w:lineRule="auto" w:before="104" w:after="0"/>
+              <w:ind w:left="148" w:right="0" w:firstLine="0"/>
+              <w:jc w:val="left"/>
+            </w:pPr>
+            <w:r>
+              <w:rPr>
+                <w:w w:val="97.94163911238961"/>
+                <w:rFonts w:ascii="Anthropic Sans Print" w:hAnsi="Anthropic Sans Print" w:eastAsia="Anthropic Sans Print"/>
+                <w:b w:val="0"/>
+                <w:i w:val="0"/>
+                <w:color w:val="52514E"/>
+                <w:sz w:val="23"/>
+              </w:rPr>
+              <w:t>Owner</w:t>
+            </w:r>
+          </w:p>
+        </w:tc>
+        <w:tc>
+          <w:tcPr>
+            <w:tcW w:type="dxa" w:w="3084"/>
+            <w:tcBorders>
+              <w:start w:sz="6.400000000000091" w:val="single" w:color="#E7E4DB"/>
               <w:top w:sz="6.399999999999977" w:val="single" w:color="#E7E4DB"/>
               <w:end w:sz="5.599999999999909" w:val="single" w:color="#E7E4DB"/>
               <w:bottom w:sz="6.399999999999977" w:val="single" w:color="#E7E4DB"/>
@@ -8036,44 +8093,7 @@
               <w:autoSpaceDE w:val="0"/>
               <w:widowControl/>
               <w:spacing w:line="240" w:lineRule="auto" w:before="104" w:after="0"/>
-              <w:ind w:left="146" w:right="0" w:firstLine="0"/>
-              <w:jc w:val="left"/>
-            </w:pPr>
-            <w:r>
-              <w:rPr>
-                <w:w w:val="97.94163911238961"/>
-                <w:rFonts w:ascii="Anthropic Sans Print" w:hAnsi="Anthropic Sans Print" w:eastAsia="Anthropic Sans Print"/>
-                <w:b w:val="0"/>
-                <w:i w:val="0"/>
-                <w:color w:val="52514E"/>
-                <w:sz w:val="23"/>
-              </w:rPr>
-              <w:t>Owner</w:t>
-            </w:r>
-          </w:p>
-        </w:tc>
-        <w:tc>
-          <w:tcPr>
-            <w:tcW w:type="dxa" w:w="3068"/>
-            <w:tcBorders>
-              <w:start w:sz="5.599999999999909" w:val="single" w:color="#E7E4DB"/>
-              <w:top w:sz="6.399999999999977" w:val="single" w:color="#E7E4DB"/>
-              <w:end w:sz="5.599999999999909" w:val="single" w:color="#E7E4DB"/>
-              <w:bottom w:sz="6.399999999999977" w:val="single" w:color="#E7E4DB"/>
-            </w:tcBorders>
-            <w:shd w:fill="f5f2ec"/>
-            <w:tcMar>
-              <w:start w:w="0" w:type="dxa"/>
-              <w:end w:w="0" w:type="dxa"/>
-            </w:tcMar>
-          </w:tcPr>
-          <w:p>
-            <w:pPr>
-              <w:autoSpaceDN w:val="0"/>
-              <w:autoSpaceDE w:val="0"/>
-              <w:widowControl/>
-              <w:spacing w:line="240" w:lineRule="auto" w:before="104" w:after="0"/>
-              <w:ind w:left="142" w:right="0" w:firstLine="0"/>
+              <w:ind w:left="154" w:right="0" w:firstLine="0"/>
               <w:jc w:val="left"/>
             </w:pPr>
             <w:r>
@@ -8110,7 +8130,7 @@
               <w:autoSpaceDE w:val="0"/>
               <w:widowControl/>
               <w:spacing w:line="262" w:lineRule="auto" w:before="104" w:after="0"/>
-              <w:ind w:left="152" w:right="144" w:firstLine="0"/>
+              <w:ind w:left="150" w:right="144" w:firstLine="0"/>
               <w:jc w:val="left"/>
             </w:pPr>
             <w:r>
@@ -8253,11 +8273,11 @@
         </w:tc>
         <w:tc>
           <w:tcPr>
-            <w:tcW w:type="dxa" w:w="1782"/>
+            <w:tcW w:type="dxa" w:w="1766"/>
             <w:tcBorders>
               <w:start w:sz="5.600000000000023" w:val="single" w:color="#E7E4DB"/>
               <w:top w:sz="6.399999999999977" w:val="single" w:color="#E7E4DB"/>
-              <w:end w:sz="5.599999999999909" w:val="single" w:color="#E7E4DB"/>
+              <w:end w:sz="6.400000000000091" w:val="single" w:color="#E7E4DB"/>
               <w:bottom w:sz="6.400000000000091" w:val="single" w:color="#E7E4DB"/>
             </w:tcBorders>
             <w:tcMar>
@@ -8271,7 +8291,7 @@
               <w:autoSpaceDE w:val="0"/>
               <w:widowControl/>
               <w:spacing w:line="238" w:lineRule="auto" w:before="106" w:after="0"/>
-              <w:ind w:left="146" w:right="0" w:firstLine="0"/>
+              <w:ind w:left="148" w:right="0" w:firstLine="0"/>
               <w:jc w:val="left"/>
             </w:pPr>
             <w:r>
@@ -8289,9 +8309,9 @@
         </w:tc>
         <w:tc>
           <w:tcPr>
-            <w:tcW w:type="dxa" w:w="3068"/>
+            <w:tcW w:type="dxa" w:w="3084"/>
             <w:tcBorders>
-              <w:start w:sz="5.599999999999909" w:val="single" w:color="#E7E4DB"/>
+              <w:start w:sz="6.400000000000091" w:val="single" w:color="#E7E4DB"/>
               <w:top w:sz="6.399999999999977" w:val="single" w:color="#E7E4DB"/>
               <w:end w:sz="5.599999999999909" w:val="single" w:color="#E7E4DB"/>
               <w:bottom w:sz="6.400000000000091" w:val="single" w:color="#E7E4DB"/>
@@ -8307,7 +8327,7 @@
               <w:autoSpaceDE w:val="0"/>
               <w:widowControl/>
               <w:spacing w:line="245" w:lineRule="auto" w:before="106" w:after="56"/>
-              <w:ind w:left="204" w:right="0" w:firstLine="0"/>
+              <w:ind w:left="214" w:right="0" w:firstLine="0"/>
               <w:jc w:val="left"/>
             </w:pPr>
             <w:r>
@@ -8354,7 +8374,7 @@
               <w:tblInd w:w="150.0" w:type="dxa"/>
             </w:tblPr>
             <w:tblGrid>
-              <w:gridCol w:w="3068"/>
+              <w:gridCol w:w="3084"/>
             </w:tblGrid>
             <w:tr>
               <w:trPr>
@@ -8362,7 +8382,7 @@
               </w:trPr>
               <w:tc>
                 <w:tcPr>
-                  <w:tcW w:type="dxa" w:w="1452"/>
+                  <w:tcW w:type="dxa" w:w="1466"/>
                   <w:tcBorders/>
                   <w:shd w:fill="f2f1ec"/>
                   <w:tcMar>
@@ -8424,7 +8444,7 @@
               <w:autoSpaceDE w:val="0"/>
               <w:widowControl/>
               <w:spacing w:line="266" w:lineRule="auto" w:before="106" w:after="0"/>
-              <w:ind w:left="152" w:right="432" w:firstLine="0"/>
+              <w:ind w:left="150" w:right="432" w:firstLine="0"/>
               <w:jc w:val="left"/>
             </w:pPr>
             <w:r>
@@ -8661,11 +8681,11 @@
         </w:tc>
         <w:tc>
           <w:tcPr>
-            <w:tcW w:type="dxa" w:w="1782"/>
+            <w:tcW w:type="dxa" w:w="1766"/>
             <w:tcBorders>
               <w:start w:sz="5.600000000000023" w:val="single" w:color="#E7E4DB"/>
               <w:top w:sz="6.400000000000091" w:val="single" w:color="#E7E4DB"/>
-              <w:end w:sz="5.599999999999909" w:val="single" w:color="#E7E4DB"/>
+              <w:end w:sz="6.400000000000091" w:val="single" w:color="#E7E4DB"/>
               <w:bottom w:sz="5.599999999999909" w:val="single" w:color="#E7E4DB"/>
             </w:tcBorders>
             <w:tcMar>
@@ -8679,8 +8699,8 @@
               <w:autoSpaceDE w:val="0"/>
               <w:widowControl/>
               <w:spacing w:line="259" w:lineRule="auto" w:before="106" w:after="0"/>
-              <w:ind w:left="146" w:right="720" w:firstLine="0"/>
-              <w:jc w:val="left"/>
+              <w:ind w:left="144" w:right="720" w:firstLine="0"/>
+              <w:jc w:val="center"/>
             </w:pPr>
             <w:r>
               <w:rPr>
@@ -8691,7 +8711,7 @@
                 <w:color w:val="1F1E1D"/>
                 <w:sz w:val="23"/>
               </w:rPr>
-              <w:t xml:space="preserve">Fourth </w:t>
+              <w:t xml:space="preserve">Shared </w:t>
             </w:r>
             <w:r>
               <w:br/>
@@ -8705,15 +8725,15 @@
                 <w:color w:val="1F1E1D"/>
                 <w:sz w:val="23"/>
               </w:rPr>
-              <w:t>member</w:t>
+              <w:t>(group)</w:t>
             </w:r>
           </w:p>
         </w:tc>
         <w:tc>
           <w:tcPr>
-            <w:tcW w:type="dxa" w:w="3068"/>
+            <w:tcW w:type="dxa" w:w="3084"/>
             <w:tcBorders>
-              <w:start w:sz="5.599999999999909" w:val="single" w:color="#E7E4DB"/>
+              <w:start w:sz="6.400000000000091" w:val="single" w:color="#E7E4DB"/>
               <w:top w:sz="6.400000000000091" w:val="single" w:color="#E7E4DB"/>
               <w:end w:sz="5.599999999999909" w:val="single" w:color="#E7E4DB"/>
               <w:bottom w:sz="5.599999999999909" w:val="single" w:color="#E7E4DB"/>
@@ -8729,7 +8749,7 @@
               <w:autoSpaceDE w:val="0"/>
               <w:widowControl/>
               <w:spacing w:line="262" w:lineRule="auto" w:before="106" w:after="42"/>
-              <w:ind w:left="204" w:right="864" w:firstLine="0"/>
+              <w:ind w:left="214" w:right="864" w:firstLine="0"/>
               <w:jc w:val="left"/>
             </w:pPr>
             <w:r>
@@ -8811,7 +8831,7 @@
               <w:tblInd w:w="150.0" w:type="dxa"/>
             </w:tblPr>
             <w:tblGrid>
-              <w:gridCol w:w="3068"/>
+              <w:gridCol w:w="3084"/>
             </w:tblGrid>
             <w:tr>
               <w:trPr>
@@ -8881,7 +8901,7 @@
               <w:autoSpaceDE w:val="0"/>
               <w:widowControl/>
               <w:spacing w:line="271" w:lineRule="auto" w:before="106" w:after="0"/>
-              <w:ind w:left="152" w:right="144" w:firstLine="0"/>
+              <w:ind w:left="150" w:right="144" w:firstLine="0"/>
               <w:jc w:val="left"/>
             </w:pPr>
             <w:r>

</xml_diff>